<commit_message>
Add section dividers to CV
</commit_message>
<xml_diff>
--- a/downloads/Ayush_Chakraborty_CV.docx
+++ b/downloads/Ayush_Chakraborty_CV.docx
@@ -12697,7 +12697,10 @@
   <w:style w:type="paragraph" w:customStyle="1" w:styleId="CVSection">
     <w:name w:val="CV Section"/>
     <w:pPr>
-      <w:spacing w:before="120" w:after="50"/>
+      <w:spacing w:before="120" w:after="70"/>
+      <w:pBdr>
+        <w:bottom w:val="single" w:sz="4" w:space="2" w:color="9A9A9A"/>
+      </w:pBdr>
     </w:pPr>
     <w:rPr>
       <w:rFonts w:ascii="Arial" w:hAnsi="Arial"/>

</xml_diff>